<commit_message>
docs: refine client proposal with layman titles, exact pricing Rs 45678 and Rs 78910, clean fonts, and client proofreading scope (v0.2.6-beta)
</commit_message>
<xml_diff>
--- a/docs/PROPOSAL_SK_SUTRAS_UDYOGA_SUTRAS.docx
+++ b/docs/PROPOSAL_SK_SUTRAS_UDYOGA_SUTRAS.docx
@@ -21,7 +21,7 @@
           <w:color w:val="0B5394"/>
           <w:sz w:val="24"/>
         </w:rPr>
-        <w:t>Autonomous Tri-Agent AI Synthesis &amp; Publication Framework for SK Sutras (Udyoga Sutras)</w:t>
+        <w:t>Autonomous Multi-Agent AI Synthesis &amp; Digital Draft Framework for SK Sutras (Udyoga Sutras)</w:t>
       </w:r>
     </w:p>
     <w:p>
@@ -81,7 +81,7 @@
     </w:p>
     <w:p>
       <w:r>
-        <w:t>Hiranyam AI Labs is pleased to present this formal proposal to Shri Shripad Kulkarni for the autonomous agentic AI synthesis and publication of the authoritative comparative treatise: SK Sutras (Udyoga Sutras). This framework orchestrates the 84 Narada Bhakti Sutras and the 100 Shandilya Bhakti Sutras into a unified publication draft, formulating original Sanskrit shlokas and comprehensive Marathi Udyoga Bhashya commentary for modern enterprise and life-duty.</w:t>
+        <w:t>Hiranyam AI Labs is pleased to present this formal proposal to Shri Shripad Kulkarni for the autonomous agentic AI synthesis and digital draft preparation of the authoritative comparative treatise: SK Sutras (Udyoga Sutras). This framework orchestrates the 84 Narada Bhakti Sutras and the 100 Shandilya Bhakti Sutras into a unified digital draft, formulating original Sanskrit shlokas and comprehensive Marathi Udyoga Bhashya commentary for modern enterprise and life-duty.</w:t>
       </w:r>
     </w:p>
     <w:p>
@@ -89,16 +89,16 @@
         <w:pStyle w:val="Heading1"/>
       </w:pPr>
       <w:r>
-        <w:t>2. The Three Specialized Agents</w:t>
+        <w:t>2. How the Three Dedicated Book Specialists Work Together</w:t>
       </w:r>
     </w:p>
     <w:p>
       <w:r>
-        <w:t>1. Narada Bhakti Sutra Specialist Agent: Represents Devarshi Narada's experiential, devotional school (84 sutras).</w:t>
+        <w:t>1. Narada Bhakti Sutra Specialist Agent: Represents Devarshi Narada's experiential devotional school (84 sutras).</w:t>
         <w:br/>
-        <w:t>2. Shandilya Bhakti Sutra Specialist Agent: Represents Maharshi Shandilya's epistemological, Vedantic school (100 sutras in ChromaDB).</w:t>
+        <w:t>2. Shandilya Bhakti Sutra Specialist Agent: Represents Maharshi Shandilya's epistemological, rational school (100 sutras in ChromaDB).</w:t>
         <w:br/>
-        <w:t>3. Sutrakar Agent (Master Arbiter &amp; Creative Synthesizer): Enforces non-compulsory matching, eliminates duplicate explanations, formulates original Sanskrit shlokas for verified correspondences, and authors the multi-paragraph Marathi Udyoga Bhashya.</w:t>
+        <w:t>3. Sutrakar Agent (Master Coordinator &amp; Synthesizer): Enforces non-compulsory matching, eliminates duplicate explanations, composes original Sanskrit shlokas for verified correspondences, and authors the multi-paragraph Marathi Udyoga Bhashya commentary.</w:t>
       </w:r>
     </w:p>
     <w:p>
@@ -106,39 +106,39 @@
         <w:pStyle w:val="Heading1"/>
       </w:pPr>
       <w:r>
-        <w:t>3. Two Deployment Options &amp; Quotation</w:t>
+        <w:t>3. Technology Choices and Solution Options Explained</w:t>
       </w:r>
     </w:p>
     <w:p>
       <w:r>
-        <w:t>Option 1: Hybrid Architecture (ChatGPT + Gemini Sutrakar)</w:t>
+        <w:t>Option 1: Hybrid Solution (ChatGPT for Two Books + Google Gemini for Master Coordinator)</w:t>
         <w:br/>
         <w:t>• Narada Agent on ChatGPT (GPT-4o), Shandilya Agent on ChatGPT (GPT-4o), Sutrakar Agent on Google Gemini (Gemini 1.5 Pro).</w:t>
         <w:br/>
-        <w:t>• Sutrakar Agent uses Gemini for expert knowledge in Vedic literatures, classical Sanskrit translation, and huge context memory.</w:t>
+        <w:t>• Sutrakar Agent uses Gemini for expert knowledge in Vedic literatures, classical Sanskrit, and massive context memory.</w:t>
         <w:br/>
-        <w:t>• Model &amp; Infrastructure Cost: ₹18,000 INR</w:t>
+        <w:t>• AI Compute &amp; Cloud Infrastructure (50 cycles): Rs. 18,000 INR</w:t>
         <w:br/>
-        <w:t>• Hiranyam AI Development, Publication &amp; Proofreading Service Fee: ₹30,000 INR</w:t>
+        <w:t>• Hiranyam AI Development and Service Fee: Rs. 27,678 INR</w:t>
         <w:br/>
-        <w:t>• Total Option 1 Investment: ₹48,000 INR</w:t>
+        <w:t>• Total Option 1 Proposed Investment: Rs. 45,678 INR</w:t>
         <w:br/>
         <w:br/>
-        <w:t>Option 2: Pure Google DeepMind Gemini Specialized Architecture (Recommended)</w:t>
+        <w:t>Option 2: Dedicated Google Gemini Vedic Specialist Solution (Recommended)</w:t>
         <w:br/>
-        <w:t>• All three agents deployed on Google Gemini (Gemini 1.5 Pro Specialized).</w:t>
+        <w:t>• All three specialists deployed on Google Gemini (Gemini 1.5 Pro Specialized).</w:t>
         <w:br/>
-        <w:t>• Deepest native corpus of Vedic literature, Sanskrit grammar, and nuanced Marathi translation.</w:t>
+        <w:t>• Deepest native corpus of Vedic literature, Sanskrit grammar, and classical Marathi commentary.</w:t>
         <w:br/>
-        <w:t>• Native formulation of brand-new, original metered Sanskrit shlokas (new Udyoga Sutras) for approved pairs.</w:t>
+        <w:t>• Composes brand-new, original metered Sanskrit shlokas (new Udyoga Sutras) for approved pairs.</w:t>
         <w:br/>
         <w:t>• Unified context caching ensuring zero duplicate explanations across 50 full cycles of canon re-generation.</w:t>
         <w:br/>
-        <w:t>• Model, Deep Caching &amp; Infrastructure Cost: ₹45,000 INR</w:t>
+        <w:t>• AI Compute, Deep Caching, High-Reasoning &amp; Infrastructure: Rs. 45,000 INR</w:t>
         <w:br/>
-        <w:t>• Hiranyam AI Development, Publication &amp; Proofreading Service Fee: ₹30,000 INR</w:t>
+        <w:t>• Hiranyam AI Development and Service Fee: Rs. 33,910 INR</w:t>
         <w:br/>
-        <w:t>• Total Option 2 Investment: ₹75,000 INR</w:t>
+        <w:t>• Total Option 2 Proposed Investment: Rs. 78,910 INR</w:t>
       </w:r>
     </w:p>
     <w:p>
@@ -146,20 +146,32 @@
         <w:pStyle w:val="Heading1"/>
       </w:pPr>
       <w:r>
-        <w:t>4. Scope of Hiranyam AI Service Commitment (₹30,000 Fee)</w:t>
+        <w:t>4. Scope of Services Covered under Hiranyam AI Development and Service Fees</w:t>
       </w:r>
     </w:p>
     <w:p>
       <w:r>
-        <w:t>• Full multi-agent software engineering, vector database setup, and prompt calibration.</w:t>
+        <w:t>Development and Service Fee by Option:</w:t>
         <w:br/>
-        <w:t>• Senior Citizen (65+ Mode) Web Review Portal for Shri Shripad Kulkarni with dynamic font scaling and large touch affordances.</w:t>
+        <w:t>• Under Option 1: Hiranyam AI Development and Service Fee is Rs. 27,678 INR</w:t>
         <w:br/>
-        <w:t>• Generating publication-ready PDF books for author proofreading and review.</w:t>
+        <w:t>• Under Option 2: Hiranyam AI Development and Service Fee is Rs. 33,910 INR</w:t>
         <w:br/>
-        <w:t>• Up to 50 cycles of testing, re-communication, author revisions, and corrections until the finalized print-ready copy is achieved.</w:t>
         <w:br/>
-        <w:t>• Final pre-press typesetting and formatting ready for physical printing.</w:t>
+        <w:t>Included in Our Service Fee:</w:t>
+        <w:br/>
+        <w:t>• Multi-agent software engineering, ChromaDB vector database setup, and prompt calibration.</w:t>
+        <w:br/>
+        <w:t>• Senior Citizen (65+ Mode) Web Review Portal for Shri Shripad Kulkarni with extra-large fonts and simple layout.</w:t>
+        <w:br/>
+        <w:t>• Pre-proofreading digital book PDF delivery with Devanagari Sanskrit verses and Marathi commentary for client review.</w:t>
+        <w:br/>
+        <w:t>• Up to 50 cycles of testing, re-communication, author revisions, and corrections until the final text is approved.</w:t>
+        <w:br/>
+        <w:t>• Delivery of finalized digital master PDF ready for client's publishing team.</w:t>
+        <w:br/>
+        <w:br/>
+        <w:t>*Note: Actual proofreading, physical printing, bookbinding, and publishing will be handled independently by the client.</w:t>
       </w:r>
     </w:p>
     <w:p>
@@ -199,7 +211,7 @@
           </w:tcPr>
           <w:p>
             <w:r>
-              <w:t>Option 1 (Hybrid)</w:t>
+              <w:t>Option 1 (Hybrid Solution)</w:t>
             </w:r>
           </w:p>
         </w:tc>
@@ -221,7 +233,7 @@
           </w:tcPr>
           <w:p>
             <w:r>
-              <w:t>AI Compute &amp; Token Infrastructure (50 Cycles)</w:t>
+              <w:t>AI Cloud Compute &amp; Infrastructure (50 Cycles)</w:t>
             </w:r>
           </w:p>
         </w:tc>
@@ -231,7 +243,7 @@
           </w:tcPr>
           <w:p>
             <w:r>
-              <w:t>₹18,000 INR</w:t>
+              <w:t>Rs. 18,000 INR</w:t>
             </w:r>
           </w:p>
         </w:tc>
@@ -241,7 +253,7 @@
           </w:tcPr>
           <w:p>
             <w:r>
-              <w:t>₹45,000 INR</w:t>
+              <w:t>Rs. 45,000 INR</w:t>
             </w:r>
           </w:p>
         </w:tc>
@@ -253,7 +265,7 @@
           </w:tcPr>
           <w:p>
             <w:r>
-              <w:t>Hiranyam AI Development &amp; Publication Fee</w:t>
+              <w:t>Hiranyam AI Development and Service Fee</w:t>
             </w:r>
           </w:p>
         </w:tc>
@@ -263,7 +275,7 @@
           </w:tcPr>
           <w:p>
             <w:r>
-              <w:t>₹30,000 INR</w:t>
+              <w:t>Rs. 27,678 INR</w:t>
             </w:r>
           </w:p>
         </w:tc>
@@ -273,7 +285,7 @@
           </w:tcPr>
           <w:p>
             <w:r>
-              <w:t>₹30,000 INR</w:t>
+              <w:t>Rs. 33,910 INR</w:t>
             </w:r>
           </w:p>
         </w:tc>
@@ -285,7 +297,7 @@
           </w:tcPr>
           <w:p>
             <w:r>
-              <w:t>Proofreading PDF Delivery &amp; Iterative Revisions</w:t>
+              <w:t>Original Sanskrit Shloka Formulation</w:t>
             </w:r>
           </w:p>
         </w:tc>
@@ -295,7 +307,7 @@
           </w:tcPr>
           <w:p>
             <w:r>
-              <w:t>Included</w:t>
+              <w:t>Standard Synthesis</w:t>
             </w:r>
           </w:p>
         </w:tc>
@@ -305,7 +317,7 @@
           </w:tcPr>
           <w:p>
             <w:r>
-              <w:t>Included (with Original Shlokas)</w:t>
+              <w:t>Included (Original Sanskrit Shlokas)</w:t>
             </w:r>
           </w:p>
         </w:tc>
@@ -317,7 +329,7 @@
           </w:tcPr>
           <w:p>
             <w:r>
-              <w:t>TOTAL INVESTMENT</w:t>
+              <w:t>Pre-Proofreading PDF Deliveries &amp; 50 Revisions</w:t>
             </w:r>
           </w:p>
         </w:tc>
@@ -327,7 +339,7 @@
           </w:tcPr>
           <w:p>
             <w:r>
-              <w:t>₹48,000 INR</w:t>
+              <w:t>Included till Master Delivery</w:t>
             </w:r>
           </w:p>
         </w:tc>
@@ -337,7 +349,39 @@
           </w:tcPr>
           <w:p>
             <w:r>
-              <w:t>₹75,000 INR</w:t>
+              <w:t>Included till Master Delivery</w:t>
+            </w:r>
+          </w:p>
+        </w:tc>
+      </w:tr>
+      <w:tr>
+        <w:tc>
+          <w:tcPr>
+            <w:tcW w:type="dxa" w:w="3360"/>
+          </w:tcPr>
+          <w:p>
+            <w:r>
+              <w:t>TOTAL PROPOSED INVESTMENT</w:t>
+            </w:r>
+          </w:p>
+        </w:tc>
+        <w:tc>
+          <w:tcPr>
+            <w:tcW w:type="dxa" w:w="3360"/>
+          </w:tcPr>
+          <w:p>
+            <w:r>
+              <w:t>Rs. 45,678 INR</w:t>
+            </w:r>
+          </w:p>
+        </w:tc>
+        <w:tc>
+          <w:tcPr>
+            <w:tcW w:type="dxa" w:w="3360"/>
+          </w:tcPr>
+          <w:p>
+            <w:r>
+              <w:t>Rs. 78,910 INR</w:t>
             </w:r>
           </w:p>
         </w:tc>
@@ -353,6 +397,9 @@
     </w:p>
     <w:p>
       <w:r>
+        <w:br/>
+        <w:t>Accepted Option:  [  ] Option 1 (Rs. 45,678 INR)       [  ] Option 2 (Rs. 78,910 INR)</w:t>
+        <w:br/>
         <w:br/>
         <w:t>Client Signature: _______________________      Date: _______________</w:t>
         <w:br/>

</xml_diff>